<commit_message>
Dukung soal Benar-Salah & Menjodohkan di CBT (tidak ada lagi soal dilewati)
Sebelumnya kedua bentuk soal ini dibuang saat ekspor karena aplikasi CBT belum
mendukungnya. Kini didukung penuh:
- Engine CBT: BS dirender sbg tabel radio Benar/Salah, Menjodohkan sbg dropdown
  pasangan yang diacak; keduanya dinilai proporsional (skor sebagian) dan tampil
  di halaman pembahasan.
- Parser naskah Word: format baru "- pernyataan | jawaban" untuk [BS] & [JODOH].
- Ekspor dari AKM/TKA: pernyataan diambil dari tabel di bagian C, kuncinya dari
  bagian D ("Benar, Salah, Benar" untuk BS; "1-C, 2-A" untuk Menjodohkan).
- Template Word contoh & panduan format di UI diperbarui.

Perbaikan lain: isi tabel yang diawali angka ("1. Indonesia" di kolom kiri tabel
menjodohkan) tidak lagi salah dikira awal soal baru.

Co-Authored-By: Claude Opus 4.8 <noreply@anthropic.com>
</commit_message>
<xml_diff>
--- a/public/template-soal-cbt.docx
+++ b/public/template-soal-cbt.docx
@@ -7,7 +7,7 @@
         <w:pStyle w:val="Heading1"/>
       </w:pPr>
       <w:r>
-        <w:t xml:space="preserve">Template Naskah Soal — Generator CBT HTML</w:t>
+        <w:t xml:space="preserve">Template Naskah Soal — Generator CBT</w:t>
       </w:r>
     </w:p>
     <w:p>
@@ -16,47 +16,52 @@
           <w:b/>
           <w:bCs/>
         </w:rPr>
-        <w:t xml:space="preserve">Petunjuk pengisian (baca dulu, lalu HAPUS bagian petunjuk ini sebelum diupload ke generator):</w:t>
-      </w:r>
-    </w:p>
-    <w:p>
-      <w:r>
-        <w:t xml:space="preserve">1. Setiap soal WAJIB diawali baris "Nomor. [TIPE] teks soal" — TIPE salah satu dari: PG, PGK, ISIAN, ESSAY.</w:t>
-      </w:r>
-    </w:p>
-    <w:p>
-      <w:r>
-        <w:t xml:space="preserve">2. Untuk PG/PGK, tulis opsi di baris terpisah: "A. teks", "B. teks", dst. Beri tanda bintang (*) di depan huruf opsi yang benar, misal "*B. Jakarta".</w:t>
-      </w:r>
-    </w:p>
-    <w:p>
-      <w:r>
-        <w:t xml:space="preserve">3. PG hanya boleh punya TEPAT SATU opsi bertanda bintang. PGK boleh lebih dari satu.</w:t>
-      </w:r>
-    </w:p>
-    <w:p>
-      <w:r>
-        <w:t xml:space="preserve">4. Untuk ISIAN, tulis baris "Kunci: jawaban" — boleh beberapa jawaban diterima dipisah tanda "|", misal "Kunci: 144 | 144.0".</w:t>
-      </w:r>
-    </w:p>
-    <w:p>
-      <w:r>
-        <w:t xml:space="preserve">5. Untuk ESSAY tidak perlu baris Kunci — dinilai manual oleh guru.</w:t>
-      </w:r>
-    </w:p>
-    <w:p>
-      <w:r>
-        <w:t xml:space="preserve">6. Baris "Pembahasan: teks" bersifat opsional untuk semua tipe, ditampilkan saat siswa melihat pembahasan setelah selesai ujian.</w:t>
-      </w:r>
-    </w:p>
-    <w:p>
-      <w:r>
-        <w:t xml:space="preserve">7. Gambar bisa disisipkan langsung di Word (Insert &gt; Picture) di baris manapun dalam satu soal — akan ikut terbawa otomatis ke aplikasi CBT.</w:t>
-      </w:r>
-    </w:p>
-    <w:p>
-      <w:r>
-        <w:t xml:space="preserve">8. Jangan gunakan format daftar bernomor/bullet otomatis dari Word untuk opsi jawaban — ketik manual "A.", "B.", dst sebagai teks biasa.</w:t>
+        <w:t xml:space="preserve">Petunjuk (baca dulu, lalu HAPUS bagian petunjuk ini sebelum diupload):</w:t>
+      </w:r>
+    </w:p>
+    <w:p>
+      <w:r>
+        <w:t xml:space="preserve">1. Setiap soal diawali baris "Nomor. [TIPE] teks soal". TIPE: PG, PGK, ISIAN, ESSAY, BS, atau JODOH.</w:t>
+      </w:r>
+    </w:p>
+    <w:p>
+      <w:r>
+        <w:t xml:space="preserve">2. PG/PGK: tulis opsi per baris "A. teks". Beri tanda * di depan huruf opsi yang benar (contoh: *B. Jakarta). PG tepat satu bintang, PGK boleh lebih dari satu.</w:t>
+      </w:r>
+    </w:p>
+    <w:p>
+      <w:r>
+        <w:t xml:space="preserve">3. ISIAN: tulis baris "Kunci: jawaban". Beberapa jawaban yang diterima dipisah tanda | (contoh: Kunci: 144 | 144.0).</w:t>
+      </w:r>
+    </w:p>
+    <w:p>
+      <w:r>
+        <w:t xml:space="preserve">4. BS (Benar-Salah): tiap pernyataan ditulis "- pernyataan | BENAR" atau "- pernyataan | SALAH".</w:t>
+      </w:r>
+    </w:p>
+    <w:p>
+      <w:r>
+        <w:t xml:space="preserve">5. JODOH (Menjodohkan): tiap pasangan ditulis "- pernyataan | jawaban pasangannya". Pilihan jawaban akan diacak otomatis untuk siswa.</w:t>
+      </w:r>
+    </w:p>
+    <w:p>
+      <w:r>
+        <w:t xml:space="preserve">6. ESSAY: tidak perlu kunci, dinilai manual oleh guru dan tidak masuk skor otomatis.</w:t>
+      </w:r>
+    </w:p>
+    <w:p>
+      <w:r>
+        <w:t xml:space="preserve">7. Baris "Pembahasan: teks" opsional untuk semua tipe.</w:t>
+      </w:r>
+    </w:p>
+    <w:p>
+      <w:r>
+        <w:t xml:space="preserve">8. Gambar (Insert &gt; Picture) dan tabel (Insert &gt; Table) boleh disisipkan di dalam soal — ikut terbawa otomatis ke aplikasi CBT.</w:t>
+      </w:r>
+    </w:p>
+    <w:p>
+      <w:r>
+        <w:t xml:space="preserve">9. Jangan pakai penomoran/bullet otomatis Word untuk opsi jawaban — ketik manual sebagai teks biasa.</w:t>
       </w:r>
     </w:p>
     <w:p>
@@ -70,7 +75,7 @@
           <w:b/>
           <w:bCs/>
         </w:rPr>
-        <w:t xml:space="preserve">=========== CONTOH SOAL (hapus baris petunjuk di atas, mulai upload dari sini) ===========</w:t>
+        <w:t xml:space="preserve">=========== CONTOH SOAL (mulai upload dari sini) ===========</w:t>
       </w:r>
     </w:p>
     <w:p>
@@ -140,7 +145,7 @@
     </w:p>
     <w:p>
       <w:r>
-        <w:t xml:space="preserve">Pembahasan: Bilangan prima adalah bilangan yang hanya memiliki dua faktor, yaitu 1 dan dirinya sendiri. Maka 2 dan 5 adalah bilangan prima.</w:t>
+        <w:t xml:space="preserve">Pembahasan: Bilangan prima hanya memiliki dua faktor, yaitu 1 dan dirinya sendiri.</w:t>
       </w:r>
     </w:p>
     <w:p>
@@ -170,12 +175,72 @@
     </w:p>
     <w:p>
       <w:r>
-        <w:t xml:space="preserve">4. [ESSAY] Jelaskan proses terjadinya hujan menurut siklus air!</w:t>
-      </w:r>
-    </w:p>
-    <w:p>
-      <w:r>
-        <w:t xml:space="preserve">Pembahasan: Hujan terjadi melalui tiga tahap utama: evaporasi (penguapan air), kondensasi (uap air berubah menjadi awan), dan presipitasi (air jatuh sebagai hujan).</w:t>
+        <w:t xml:space="preserve">4. [BS] Tentukan Benar atau Salah untuk setiap pernyataan berikut.</w:t>
+      </w:r>
+    </w:p>
+    <w:p>
+      <w:r>
+        <w:t xml:space="preserve">- Air membeku pada suhu 0 derajat Celsius | BENAR</w:t>
+      </w:r>
+    </w:p>
+    <w:p>
+      <w:r>
+        <w:t xml:space="preserve">- Matahari mengelilingi Bumi | SALAH</w:t>
+      </w:r>
+    </w:p>
+    <w:p>
+      <w:r>
+        <w:t xml:space="preserve">- Bumi berbentuk bulat | BENAR</w:t>
+      </w:r>
+    </w:p>
+    <w:p>
+      <w:r>
+        <w:t xml:space="preserve">Pembahasan: Matahari tidak mengelilingi Bumi, justru Bumi yang mengelilingi Matahari.</w:t>
+      </w:r>
+    </w:p>
+    <w:p>
+      <w:r>
+        <w:t xml:space="preserve"/>
+      </w:r>
+    </w:p>
+    <w:p>
+      <w:r>
+        <w:t xml:space="preserve">5. [JODOH] Pasangkan negara berikut dengan ibu kotanya.</w:t>
+      </w:r>
+    </w:p>
+    <w:p>
+      <w:r>
+        <w:t xml:space="preserve">- Indonesia | Jakarta</w:t>
+      </w:r>
+    </w:p>
+    <w:p>
+      <w:r>
+        <w:t xml:space="preserve">- Jepang | Tokyo</w:t>
+      </w:r>
+    </w:p>
+    <w:p>
+      <w:r>
+        <w:t xml:space="preserve">- Thailand | Bangkok</w:t>
+      </w:r>
+    </w:p>
+    <w:p>
+      <w:r>
+        <w:t xml:space="preserve">Pembahasan: Sesuai ibu kota masing-masing negara.</w:t>
+      </w:r>
+    </w:p>
+    <w:p>
+      <w:r>
+        <w:t xml:space="preserve"/>
+      </w:r>
+    </w:p>
+    <w:p>
+      <w:r>
+        <w:t xml:space="preserve">6. [ESSAY] Jelaskan proses terjadinya hujan menurut siklus air!</w:t>
+      </w:r>
+    </w:p>
+    <w:p>
+      <w:r>
+        <w:t xml:space="preserve">Pembahasan: Melalui evaporasi, kondensasi, dan presipitasi.</w:t>
       </w:r>
     </w:p>
     <w:sectPr>

</xml_diff>